<commit_message>
fix: restore header-article subtitle color and improve cv docx generation
</commit_message>
<xml_diff>
--- a/src/features/resume-engine/assets/cv-template.docx
+++ b/src/features/resume-engine/assets/cv-template.docx
@@ -2612,7 +2612,7 @@
           <w:tab w:val="left" w:pos="847"/>
         </w:tabs>
         <w:spacing w:before="20"/>
-        <w:ind w:right="410"/>
+        <w:ind w:left="141" w:right="410"/>
         <w:rPr>
           <w:rFonts w:asciiTheme="minorHAnsi" w:hAnsiTheme="minorHAnsi" w:cstheme="minorHAnsi"/>
           <w:sz w:val="18"/>
@@ -2625,7 +2625,7 @@
           <w:b/>
           <w:lang w:val="en-US"/>
         </w:rPr>
-        <w:t xml:space="preserve">  </w:t>
+        <w:t xml:space="preserve"/>
       </w:r>
       <w:r>
         <w:rPr>
@@ -2859,7 +2859,7 @@
           <w:tab w:val="left" w:pos="847"/>
         </w:tabs>
         <w:spacing w:before="20"/>
-        <w:ind w:right="410"/>
+        <w:ind w:left="141" w:right="410"/>
         <w:rPr>
           <w:rFonts w:asciiTheme="minorHAnsi" w:hAnsiTheme="minorHAnsi" w:cstheme="minorHAnsi"/>
           <w:sz w:val="18"/>
@@ -2872,7 +2872,7 @@
           <w:b/>
           <w:lang w:val="en-US"/>
         </w:rPr>
-        <w:t xml:space="preserve">  </w:t>
+        <w:t xml:space="preserve"/>
       </w:r>
       <w:r>
         <w:rPr>
@@ -2880,7 +2880,7 @@
           <w:b/>
           <w:lang w:val="en-US"/>
         </w:rPr>
-        <w:t xml:space="preserve"> </w:t>
+        <w:t xml:space="preserve"/>
       </w:r>
       <w:r>
         <w:rPr>

</xml_diff>

<commit_message>
feat(resume-engine): improve docx tailoring, preview, and agent rules
- Refactor ResumeTailorWorkflow into standalone components (removes antipattern)

- Add agent and Cursor rules prohibiting nested render functions

- Fix DOCX run normalization around hyperlinks to prevent Word corruption

- Prioritize tailored CV tab in job tracker when no alerts or prior CV exist

- Display ATS gap summary and Word preview simultaneously by default
</commit_message>
<xml_diff>
--- a/src/features/resume-engine/assets/cv-template.docx
+++ b/src/features/resume-engine/assets/cv-template.docx
@@ -13,7 +13,7 @@
         <mc:AlternateContent>
           <mc:Choice Requires="wpg">
             <w:drawing>
-              <wp:anchor distT="0" distB="0" distL="0" distR="0" simplePos="0" relativeHeight="487486464" behindDoc="1" locked="0" layoutInCell="1" allowOverlap="1" wp14:anchorId="14F984E7" wp14:editId="01B06445">
+              <wp:anchor distT="0" distB="0" distL="0" distR="0" simplePos="0" relativeHeight="487486464" behindDoc="1" locked="0" layoutInCell="1" allowOverlap="1" wp14:anchorId="14F984E7" wp14:editId="1872C892">
                 <wp:simplePos x="0" y="0"/>
                 <wp:positionH relativeFrom="page">
                   <wp:posOffset>-62753</wp:posOffset>
@@ -333,15 +333,20 @@
                           <pic:cNvPicPr/>
                         </pic:nvPicPr>
                         <pic:blipFill>
-                          <a:blip r:embed="rId10" cstate="print"/>
-                          <a:stretch>
-                            <a:fillRect/>
-                          </a:stretch>
+                          <a:blip r:embed="rId10">
+                            <a:extLst>
+                              <a:ext uri="{28A0092B-C50C-407E-A947-70E740481C1C}">
+                                <a14:useLocalDpi xmlns:a14="http://schemas.microsoft.com/office/drawing/2010/main" val="0"/>
+                              </a:ext>
+                            </a:extLst>
+                          </a:blip>
+                          <a:srcRect/>
+                          <a:stretch/>
                         </pic:blipFill>
                         <pic:spPr>
                           <a:xfrm>
-                            <a:off x="6290309" y="116204"/>
-                            <a:ext cx="726439" cy="895350"/>
+                            <a:off x="6317765" y="116204"/>
+                            <a:ext cx="671528" cy="895350"/>
                           </a:xfrm>
                           <a:prstGeom prst="rect">
                             <a:avLst/>
@@ -362,7 +367,7 @@
           </mc:Choice>
           <mc:Fallback>
             <w:pict>
-              <v:group w14:anchorId="46BC1D75" id="Group 1" o:spid="_x0000_s1026" style="position:absolute;margin-left:-4.95pt;margin-top:0;width:601.75pt;height:844.25pt;z-index:-15830016;mso-wrap-distance-left:0;mso-wrap-distance-right:0;mso-position-horizontal-relative:page;mso-position-vertical-relative:page;mso-width-relative:margin;mso-height-relative:margin" coordorigin="-564,63" coordsize="76427,107224" o:gfxdata="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">
+              <v:group w14:anchorId="50C6349C" id="Group 1" o:spid="_x0000_s1026" style="position:absolute;margin-left:-4.95pt;margin-top:0;width:601.75pt;height:844.25pt;z-index:-15830016;mso-wrap-distance-left:0;mso-wrap-distance-right:0;mso-position-horizontal-relative:page;mso-position-vertical-relative:page;mso-width-relative:margin;mso-height-relative:margin" coordorigin="-564,63" coordsize="76427,107224" o:gfxdata="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